<commit_message>
Migrate schedules to subgroup and specialization combinations
- Separate specialization from subgroup targeting
- Generate and validate 2026 schedule outputs
</commit_message>
<xml_diff>
--- a/src/Features/Integration/data/2026_sem1/zi/01.09.26/Orar_An_II Lic.docx
+++ b/src/Features/Integration/data/2026_sem1/zi/01.09.26/Orar_An_II Lic.docx
@@ -10713,15 +10713,14 @@
                 <w:szCs w:val="24"/>
                 <w:lang w:val="it-IT"/>
               </w:rPr>
-              <w:t>(lab,</w:t>
-            </w:r>
-            <w:r>
-              <w:rPr>
-                <w:sz w:val="24"/>
-                <w:szCs w:val="24"/>
-                <w:lang w:val="it-IT"/>
-              </w:rPr>
-              <w:t xml:space="preserve"> </w:t>
+              <w:t>(lab, par, IA2504)</w:t>
+            </w:r>
+            <w:r>
+              <w:rPr>
+                <w:sz w:val="24"/>
+                <w:szCs w:val="24"/>
+                <w:lang w:val="it-IT"/>
+              </w:rPr>
             </w:r>
             <w:r>
               <w:rPr>
@@ -10731,41 +10730,37 @@
                 <w:u w:val="single"/>
                 <w:lang w:val="it-IT"/>
               </w:rPr>
-              <w:t>par</w:t>
-            </w:r>
-            <w:r>
-              <w:rPr>
-                <w:sz w:val="24"/>
-                <w:szCs w:val="24"/>
-                <w:lang w:val="it-IT"/>
-              </w:rPr>
-              <w:t>)</w:t>
-            </w:r>
-          </w:p>
-          <w:p>
-            <w:pPr>
-              <w:jc w:val="center"/>
-              <w:rPr>
-                <w:sz w:val="24"/>
-                <w:szCs w:val="24"/>
-                <w:lang w:val="it-IT"/>
-              </w:rPr>
-            </w:pPr>
-            <w:r>
-              <w:rPr>
-                <w:sz w:val="24"/>
-                <w:szCs w:val="24"/>
-                <w:lang w:val="it-IT"/>
-              </w:rPr>
-              <w:t>IA2504:</w:t>
-            </w:r>
-            <w:r>
-              <w:rPr>
-                <w:sz w:val="24"/>
-                <w:szCs w:val="24"/>
-                <w:lang w:val="it-IT"/>
-              </w:rPr>
-              <w:t xml:space="preserve"> </w:t>
+            </w:r>
+            <w:r>
+              <w:rPr>
+                <w:sz w:val="24"/>
+                <w:szCs w:val="24"/>
+                <w:lang w:val="it-IT"/>
+              </w:rPr>
+            </w:r>
+          </w:p>
+          <w:p>
+            <w:pPr>
+              <w:jc w:val="center"/>
+              <w:rPr>
+                <w:sz w:val="24"/>
+                <w:szCs w:val="24"/>
+                <w:lang w:val="it-IT"/>
+              </w:rPr>
+            </w:pPr>
+            <w:r>
+              <w:rPr>
+                <w:sz w:val="24"/>
+                <w:szCs w:val="24"/>
+                <w:lang w:val="it-IT"/>
+              </w:rPr>
+            </w:r>
+            <w:r>
+              <w:rPr>
+                <w:sz w:val="24"/>
+                <w:szCs w:val="24"/>
+                <w:lang w:val="it-IT"/>
+              </w:rPr>
             </w:r>
             <w:r>
               <w:rPr>
@@ -11403,33 +11398,32 @@
                 <w:szCs w:val="24"/>
                 <w:lang w:val="it-IT"/>
               </w:rPr>
-              <w:t>(lab)</w:t>
-            </w:r>
-          </w:p>
-          <w:p>
-            <w:pPr>
-              <w:jc w:val="center"/>
-              <w:rPr>
-                <w:sz w:val="24"/>
-                <w:szCs w:val="24"/>
-                <w:lang w:val="it-IT"/>
-              </w:rPr>
-            </w:pPr>
-            <w:r>
-              <w:rPr>
-                <w:sz w:val="24"/>
-                <w:szCs w:val="24"/>
-                <w:lang w:val="it-IT"/>
-              </w:rPr>
-              <w:t>IA2503:</w:t>
-            </w:r>
-            <w:r>
-              <w:rPr>
-                <w:sz w:val="24"/>
-                <w:szCs w:val="24"/>
-                <w:lang w:val="it-IT"/>
-              </w:rPr>
-              <w:t xml:space="preserve"> V.Vișnevschi </w:t>
+              <w:t>(lab, IA2503)</w:t>
+            </w:r>
+          </w:p>
+          <w:p>
+            <w:pPr>
+              <w:jc w:val="center"/>
+              <w:rPr>
+                <w:sz w:val="24"/>
+                <w:szCs w:val="24"/>
+                <w:lang w:val="it-IT"/>
+              </w:rPr>
+            </w:pPr>
+            <w:r>
+              <w:rPr>
+                <w:sz w:val="24"/>
+                <w:szCs w:val="24"/>
+                <w:lang w:val="it-IT"/>
+              </w:rPr>
+            </w:r>
+            <w:r>
+              <w:rPr>
+                <w:sz w:val="24"/>
+                <w:szCs w:val="24"/>
+                <w:lang w:val="it-IT"/>
+              </w:rPr>
+              <w:t xml:space="preserve">V.Vișnevschi </w:t>
             </w:r>
             <w:r>
               <w:rPr>
@@ -12237,25 +12231,25 @@
                 <w:szCs w:val="24"/>
                 <w:lang w:val="it-IT"/>
               </w:rPr>
-              <w:t>(lab)</w:t>
-            </w:r>
-          </w:p>
-          <w:p>
-            <w:pPr>
-              <w:jc w:val="center"/>
-              <w:rPr>
-                <w:sz w:val="24"/>
-                <w:szCs w:val="24"/>
-                <w:lang w:val="it-IT"/>
-              </w:rPr>
-            </w:pPr>
-            <w:r>
-              <w:rPr>
-                <w:sz w:val="24"/>
-                <w:szCs w:val="24"/>
-                <w:lang w:val="it-IT"/>
-              </w:rPr>
-              <w:t>IA2504:V.Vișnevschi  326/4</w:t>
+              <w:t>(lab, IA2504)</w:t>
+            </w:r>
+          </w:p>
+          <w:p>
+            <w:pPr>
+              <w:jc w:val="center"/>
+              <w:rPr>
+                <w:sz w:val="24"/>
+                <w:szCs w:val="24"/>
+                <w:lang w:val="it-IT"/>
+              </w:rPr>
+            </w:pPr>
+            <w:r>
+              <w:rPr>
+                <w:sz w:val="24"/>
+                <w:szCs w:val="24"/>
+                <w:lang w:val="it-IT"/>
+              </w:rPr>
+              <w:t>V.Vișnevschi  326/4</w:t>
             </w:r>
           </w:p>
         </w:tc>

</xml_diff>